<commit_message>
avance en practiva 2
</commit_message>
<xml_diff>
--- a/Practicas/practica2/Practica 2. Docker - Hoja de Evidencias.docx
+++ b/Practicas/practica2/Practica 2. Docker - Hoja de Evidencias.docx
@@ -96,8 +96,8 @@
         <w:tblLook w:val="04A0" w:firstRow="1" w:lastRow="0" w:firstColumn="1" w:lastColumn="0" w:noHBand="0" w:noVBand="1"/>
       </w:tblPr>
       <w:tblGrid>
-        <w:gridCol w:w="3600"/>
-        <w:gridCol w:w="5420"/>
+        <w:gridCol w:w="1868"/>
+        <w:gridCol w:w="7152"/>
       </w:tblGrid>
       <w:tr>
         <w:trPr>
@@ -441,6 +441,9 @@
             <w:pPr>
               <w:spacing w:before="40" w:after="40"/>
             </w:pPr>
+            <w:r>
+              <w:t>https://github.com/dominique01Cruz/Cruz.Manuel-Com600-2-26/tree/e5a86ae242949ac7256b4d2b122dc38612f8109d/Practicas/practica2</w:t>
+            </w:r>
           </w:p>
         </w:tc>
       </w:tr>
@@ -1317,6 +1320,7 @@
                 <w:sz w:val="20"/>
                 <w:szCs w:val="20"/>
               </w:rPr>
+              <w:lastRenderedPageBreak/>
               <w:t>Laboratorio 6 — Publicar la imagen en Docker Hub</w:t>
             </w:r>
           </w:p>

</xml_diff>